<commit_message>
Practical 11: add setup and run instructions to the report
The Word/PDF report now states the database import, the server command
(php -S 127.0.0.1:8611 router.php / start-server.bat) and the URL
http://127.0.0.1:8611/index.php, matching README.md. No code changes.

Co-Authored-By: Claude Opus 5.5 <noreply@anthropic.com>
</commit_message>
<xml_diff>
--- a/Practical-11/PRAC_11_ITUE203_25CS023.docx
+++ b/Practical-11/PRAC_11_ITUE203_25CS023.docx
@@ -1805,6 +1805,167 @@
       <w:pPr>
         <w:spacing w:after="40"/>
       </w:pPr>
+    </w:p>
+    <w:p>
+      <w:pPr>
+        <w:pStyle w:val="Heading2"/>
+      </w:pPr>
+      <w:r>
+        <w:t>4.1 Setting up and running the application</w:t>
+      </w:r>
+    </w:p>
+    <w:p>
+      <w:r>
+        <w:rPr>
+          <w:b w:val="0"/>
+        </w:rPr>
+        <w:t>Practical 11 is a standalone application without a login. It needs only XAMPP's PHP and MySQL:</w:t>
+      </w:r>
+    </w:p>
+    <w:p>
+      <w:pPr>
+        <w:pStyle w:val="ListBullet"/>
+      </w:pPr>
+      <w:r>
+        <w:rPr>
+          <w:b w:val="0"/>
+        </w:rPr>
+        <w:t>Start MySQL in the XAMPP Control Panel.</w:t>
+      </w:r>
+    </w:p>
+    <w:p>
+      <w:pPr>
+        <w:pStyle w:val="ListBullet"/>
+      </w:pPr>
+      <w:r>
+        <w:rPr>
+          <w:b w:val="0"/>
+        </w:rPr>
+        <w:t xml:space="preserve">Import the database: phpMyAdmin → Import → </w:t>
+      </w:r>
+      <w:r>
+        <w:rPr>
+          <w:rFonts w:ascii="Consolas" w:hAnsi="Consolas"/>
+          <w:sz w:val="19"/>
+        </w:rPr>
+        <w:t>studenthub_prac11.sql</w:t>
+      </w:r>
+      <w:r>
+        <w:rPr>
+          <w:b w:val="0"/>
+        </w:rPr>
+        <w:t xml:space="preserve">, or </w:t>
+      </w:r>
+      <w:r>
+        <w:rPr>
+          <w:rFonts w:ascii="Consolas" w:hAnsi="Consolas"/>
+          <w:sz w:val="19"/>
+        </w:rPr>
+        <w:t>C:\xampp\mysql\bin\mysql.exe -u root &lt; studenthub_prac11.sql</w:t>
+      </w:r>
+      <w:r>
+        <w:rPr>
+          <w:b w:val="0"/>
+        </w:rPr>
+        <w:t xml:space="preserve"> in the Practical-11 folder.</w:t>
+      </w:r>
+    </w:p>
+    <w:p>
+      <w:pPr>
+        <w:pStyle w:val="ListBullet"/>
+      </w:pPr>
+      <w:r>
+        <w:rPr>
+          <w:b w:val="0"/>
+        </w:rPr>
+        <w:t xml:space="preserve">Start the server: double-click </w:t>
+      </w:r>
+      <w:r>
+        <w:rPr>
+          <w:rFonts w:ascii="Consolas" w:hAnsi="Consolas"/>
+          <w:sz w:val="19"/>
+        </w:rPr>
+        <w:t>start-server.bat</w:t>
+      </w:r>
+      <w:r>
+        <w:rPr>
+          <w:b w:val="0"/>
+        </w:rPr>
+        <w:t xml:space="preserve">, or run </w:t>
+      </w:r>
+      <w:r>
+        <w:rPr>
+          <w:rFonts w:ascii="Consolas" w:hAnsi="Consolas"/>
+          <w:sz w:val="19"/>
+        </w:rPr>
+        <w:t>C:\xampp\php\php.exe -S 127.0.0.1:8611 router.php</w:t>
+      </w:r>
+      <w:r>
+        <w:rPr>
+          <w:b w:val="0"/>
+        </w:rPr>
+        <w:t xml:space="preserve"> in the Practical-11 folder.</w:t>
+      </w:r>
+    </w:p>
+    <w:p>
+      <w:pPr>
+        <w:pStyle w:val="ListBullet"/>
+      </w:pPr>
+      <w:r>
+        <w:rPr>
+          <w:b w:val="0"/>
+        </w:rPr>
+        <w:t xml:space="preserve">Open </w:t>
+      </w:r>
+      <w:r>
+        <w:rPr>
+          <w:b/>
+        </w:rPr>
+        <w:t>http://127.0.0.1:8611/index.php</w:t>
+      </w:r>
+      <w:r>
+        <w:rPr>
+          <w:b w:val="0"/>
+        </w:rPr>
+        <w:t xml:space="preserve"> in the browser.</w:t>
+      </w:r>
+    </w:p>
+    <w:p>
+      <w:pPr>
+        <w:pStyle w:val="ListBullet"/>
+      </w:pPr>
+      <w:r>
+        <w:rPr>
+          <w:b w:val="0"/>
+        </w:rPr>
+        <w:t xml:space="preserve">Run the tests: </w:t>
+      </w:r>
+      <w:r>
+        <w:rPr>
+          <w:rFonts w:ascii="Consolas" w:hAnsi="Consolas"/>
+          <w:sz w:val="19"/>
+        </w:rPr>
+        <w:t>python tests\test_app.py</w:t>
+      </w:r>
+      <w:r>
+        <w:rPr>
+          <w:b w:val="0"/>
+        </w:rPr>
+        <w:t xml:space="preserve"> (uses the temporary database </w:t>
+      </w:r>
+      <w:r>
+        <w:rPr>
+          <w:rFonts w:ascii="Consolas" w:hAnsi="Consolas"/>
+          <w:sz w:val="19"/>
+        </w:rPr>
+        <w:t>studenthub_prac11_test</w:t>
+      </w:r>
+      <w:r>
+        <w:rPr>
+          <w:b w:val="0"/>
+        </w:rPr>
+        <w:t>).</w:t>
+      </w:r>
     </w:p>
     <w:p>
       <w:pPr>

</xml_diff>